<commit_message>
documentation: vision for this program
</commit_message>
<xml_diff>
--- a/docs/schedule.docx
+++ b/docs/schedule.docx
@@ -6,6 +6,7 @@
       <w:pPr>
         <w:jc w:val="center"/>
         <w:rPr>
+          <w:rFonts w:hint="eastAsia"/>
           <w:b/>
           <w:bCs/>
           <w:sz w:val="40"/>
@@ -26,6 +27,7 @@
     <w:p>
       <w:pPr>
         <w:rPr>
+          <w:rFonts w:hint="eastAsia"/>
           <w:b/>
           <w:bCs/>
           <w:szCs w:val="22"/>
@@ -53,6 +55,7 @@
     <w:p>
       <w:pPr>
         <w:rPr>
+          <w:rFonts w:hint="eastAsia"/>
           <w:b/>
           <w:bCs/>
           <w:szCs w:val="22"/>
@@ -122,6 +125,7 @@
     <w:p>
       <w:pPr>
         <w:rPr>
+          <w:rFonts w:hint="eastAsia"/>
           <w:b/>
           <w:bCs/>
           <w:szCs w:val="22"/>
@@ -148,25 +152,163 @@
     </w:p>
     <w:p>
       <w:pPr>
-        <w:rPr>
-          <w:b/>
-          <w:bCs/>
-          <w:szCs w:val="22"/>
-        </w:rPr>
-      </w:pPr>
-      <w:r>
-        <w:rPr>
-          <w:rFonts w:hint="eastAsia"/>
-          <w:b/>
-          <w:bCs/>
-          <w:szCs w:val="22"/>
-        </w:rPr>
-        <w:t>Gamers purchased a lot game during sales but find nowhere when decide which to play first.</w:t>
-      </w:r>
-    </w:p>
-    <w:p>
-      <w:pPr>
-        <w:rPr>
+        <w:ind w:leftChars="100" w:left="220"/>
+        <w:rPr>
+          <w:b/>
+          <w:bCs/>
+          <w:szCs w:val="22"/>
+        </w:rPr>
+      </w:pPr>
+      <w:r>
+        <w:rPr>
+          <w:rFonts w:hint="eastAsia"/>
+          <w:b/>
+          <w:bCs/>
+          <w:szCs w:val="22"/>
+        </w:rPr>
+        <w:t xml:space="preserve">1. </w:t>
+      </w:r>
+      <w:r>
+        <w:rPr>
+          <w:rFonts w:hint="eastAsia"/>
+          <w:b/>
+          <w:bCs/>
+          <w:szCs w:val="22"/>
+        </w:rPr>
+        <w:t>Gamers purchased a lot game</w:t>
+      </w:r>
+      <w:r>
+        <w:rPr>
+          <w:rFonts w:hint="eastAsia"/>
+          <w:b/>
+          <w:bCs/>
+          <w:szCs w:val="22"/>
+        </w:rPr>
+        <w:t xml:space="preserve"> </w:t>
+      </w:r>
+      <w:r>
+        <w:rPr>
+          <w:rFonts w:hint="eastAsia"/>
+          <w:b/>
+          <w:bCs/>
+          <w:szCs w:val="22"/>
+        </w:rPr>
+        <w:t>during sales but find nowhere when decide which to play first.</w:t>
+      </w:r>
+    </w:p>
+    <w:p>
+      <w:pPr>
+        <w:ind w:leftChars="100" w:left="220"/>
+        <w:rPr>
+          <w:b/>
+          <w:bCs/>
+          <w:szCs w:val="22"/>
+        </w:rPr>
+      </w:pPr>
+      <w:r>
+        <w:rPr>
+          <w:rFonts w:hint="eastAsia"/>
+          <w:b/>
+          <w:bCs/>
+          <w:szCs w:val="22"/>
+        </w:rPr>
+        <w:t>2. Gamers find it</w:t>
+      </w:r>
+      <w:r>
+        <w:rPr>
+          <w:b/>
+          <w:bCs/>
+          <w:szCs w:val="22"/>
+        </w:rPr>
+        <w:t>’</w:t>
+      </w:r>
+      <w:r>
+        <w:rPr>
+          <w:rFonts w:hint="eastAsia"/>
+          <w:b/>
+          <w:bCs/>
+          <w:szCs w:val="22"/>
+        </w:rPr>
+        <w:t xml:space="preserve">s hard to maintain it </w:t>
+      </w:r>
+      <w:r>
+        <w:rPr>
+          <w:b/>
+          <w:bCs/>
+          <w:szCs w:val="22"/>
+        </w:rPr>
+        <w:t>themselves</w:t>
+      </w:r>
+      <w:r>
+        <w:rPr>
+          <w:rFonts w:hint="eastAsia"/>
+          <w:b/>
+          <w:bCs/>
+          <w:szCs w:val="22"/>
+        </w:rPr>
+        <w:t xml:space="preserve"> for different pla</w:t>
+      </w:r>
+      <w:r>
+        <w:rPr>
+          <w:rFonts w:hint="eastAsia"/>
+          <w:b/>
+          <w:bCs/>
+          <w:szCs w:val="22"/>
+        </w:rPr>
+        <w:t>t</w:t>
+      </w:r>
+      <w:r>
+        <w:rPr>
+          <w:rFonts w:hint="eastAsia"/>
+          <w:b/>
+          <w:bCs/>
+          <w:szCs w:val="22"/>
+        </w:rPr>
+        <w:t>forms</w:t>
+      </w:r>
+      <w:r>
+        <w:rPr>
+          <w:rFonts w:hint="eastAsia"/>
+          <w:b/>
+          <w:bCs/>
+          <w:szCs w:val="22"/>
+        </w:rPr>
+        <w:t xml:space="preserve"> </w:t>
+      </w:r>
+      <w:r>
+        <w:rPr>
+          <w:rFonts w:hint="eastAsia"/>
+          <w:b/>
+          <w:bCs/>
+          <w:szCs w:val="22"/>
+        </w:rPr>
+        <w:t xml:space="preserve">(e.g. STEAM, EPIC, NINTENDO) </w:t>
+      </w:r>
+    </w:p>
+    <w:p>
+      <w:pPr>
+        <w:ind w:leftChars="100" w:left="220"/>
+        <w:rPr>
+          <w:rFonts w:hint="eastAsia"/>
+          <w:b/>
+          <w:bCs/>
+          <w:szCs w:val="22"/>
+        </w:rPr>
+      </w:pPr>
+      <w:r>
+        <w:rPr>
+          <w:rFonts w:hint="eastAsia"/>
+          <w:b/>
+          <w:bCs/>
+          <w:szCs w:val="22"/>
+        </w:rPr>
+        <w:t>3. People need a video-game Social Network</w:t>
+      </w:r>
+    </w:p>
+    <w:p>
+      <w:pPr>
+        <w:rPr>
+          <w:rFonts w:hint="eastAsia"/>
           <w:b/>
           <w:bCs/>
           <w:szCs w:val="22"/>
@@ -210,6 +352,7 @@
     <w:p>
       <w:pPr>
         <w:rPr>
+          <w:rFonts w:hint="eastAsia"/>
           <w:b/>
           <w:bCs/>
           <w:szCs w:val="22"/>
@@ -234,6 +377,7 @@
           <w:numId w:val="5"/>
         </w:numPr>
         <w:rPr>
+          <w:rFonts w:hint="eastAsia"/>
           <w:b/>
           <w:bCs/>
           <w:szCs w:val="22"/>
@@ -257,6 +401,7 @@
           <w:numId w:val="5"/>
         </w:numPr>
         <w:rPr>
+          <w:rFonts w:hint="eastAsia"/>
           <w:b/>
           <w:bCs/>
           <w:szCs w:val="22"/>
@@ -300,6 +445,7 @@
           <w:numId w:val="5"/>
         </w:numPr>
         <w:rPr>
+          <w:rFonts w:hint="eastAsia"/>
           <w:b/>
           <w:bCs/>
           <w:szCs w:val="22"/>
@@ -323,6 +469,7 @@
           <w:numId w:val="5"/>
         </w:numPr>
         <w:rPr>
+          <w:rFonts w:hint="eastAsia"/>
           <w:b/>
           <w:bCs/>
           <w:szCs w:val="22"/>
@@ -346,6 +493,7 @@
           <w:numId w:val="5"/>
         </w:numPr>
         <w:rPr>
+          <w:rFonts w:hint="eastAsia"/>
           <w:b/>
           <w:bCs/>
           <w:szCs w:val="22"/>
@@ -369,6 +517,7 @@
           <w:numId w:val="5"/>
         </w:numPr>
         <w:rPr>
+          <w:rFonts w:hint="eastAsia"/>
           <w:b/>
           <w:bCs/>
           <w:szCs w:val="22"/>
@@ -388,6 +537,7 @@
     <w:p>
       <w:pPr>
         <w:rPr>
+          <w:rFonts w:hint="eastAsia"/>
           <w:b/>
           <w:bCs/>
           <w:szCs w:val="22"/>
@@ -424,6 +574,7 @@
       <w:pPr>
         <w:ind w:firstLine="420"/>
         <w:rPr>
+          <w:rFonts w:hint="eastAsia"/>
           <w:b/>
           <w:bCs/>
           <w:szCs w:val="22"/>
@@ -455,7 +606,25 @@
           <w:bCs/>
           <w:szCs w:val="22"/>
         </w:rPr>
-        <w:t>2.  Sorting from A-Z</w:t>
+        <w:t xml:space="preserve">2.  </w:t>
+      </w:r>
+      <w:r>
+        <w:rPr>
+          <w:rFonts w:hint="eastAsia"/>
+          <w:b/>
+          <w:bCs/>
+          <w:szCs w:val="22"/>
+        </w:rPr>
+        <w:t>Print through s</w:t>
+      </w:r>
+      <w:r>
+        <w:rPr>
+          <w:rFonts w:hint="eastAsia"/>
+          <w:b/>
+          <w:bCs/>
+          <w:szCs w:val="22"/>
+        </w:rPr>
+        <w:t>orting from A-Z</w:t>
       </w:r>
     </w:p>
     <w:p>
@@ -475,12 +644,30 @@
           <w:bCs/>
           <w:szCs w:val="22"/>
         </w:rPr>
-        <w:t>3.  ELO</w:t>
-      </w:r>
-    </w:p>
-    <w:p>
-      <w:pPr>
-        <w:rPr>
+        <w:t>3.</w:t>
+      </w:r>
+      <w:r>
+        <w:rPr>
+          <w:b/>
+          <w:bCs/>
+          <w:szCs w:val="22"/>
+        </w:rPr>
+        <w:tab/>
+      </w:r>
+      <w:r>
+        <w:rPr>
+          <w:rFonts w:hint="eastAsia"/>
+          <w:b/>
+          <w:bCs/>
+          <w:szCs w:val="22"/>
+        </w:rPr>
+        <w:t>Depends on time, a game social network</w:t>
+      </w:r>
+    </w:p>
+    <w:p>
+      <w:pPr>
+        <w:rPr>
+          <w:rFonts w:hint="eastAsia"/>
           <w:b/>
           <w:bCs/>
           <w:szCs w:val="22"/>
@@ -543,6 +730,7 @@
     <w:p>
       <w:pPr>
         <w:rPr>
+          <w:rFonts w:hint="eastAsia"/>
           <w:b/>
           <w:bCs/>
           <w:szCs w:val="22"/>
@@ -1761,6 +1949,7 @@
   <w:style w:type="character" w:default="1" w:styleId="a0">
     <w:name w:val="Default Paragraph Font"/>
     <w:uiPriority w:val="1"/>
+    <w:semiHidden/>
     <w:unhideWhenUsed/>
   </w:style>
   <w:style w:type="table" w:default="1" w:styleId="a1">

</xml_diff>